<commit_message>
Rework all 3 GenGlass articles via hard-critic (A+ 96/100 each)
Richard applied the hard-critic cycle to each article and rewrote the text:
- Removed antitheses ("не X, а Y", "не только...но и") and clichés
- Neutralized soft technology-disparaging phrasing (brand rules)
- Added measurable GEO specifics (light temp K, mounting height cm)
- Kept articles distinct (guide / trends / techniques), CTA + models intact
- 0 em/en dashes across all three (incl. ranges rewritten as "от..до")
Regenerated .docx, .pdf and .html from the reworked .md.
Upgrade log: knowledge-base/solutions/2026-07-03-genglass-3-articles-hardcritic.md

Co-Authored-By: Claude Opus 4.8 <noreply@anthropic.com>
Claude-Session: https://claude.ai/code/session_0138UNtjXMgct5sLFrQvKXsM
</commit_message>
<xml_diff>
--- a/genglass-article/GenGlass_zerkala_2026_statya.docx
+++ b/genglass-article/GenGlass_zerkala_2026_statya.docx
@@ -18,7 +18,7 @@
         <w:rPr>
           <w:b w:val="0"/>
         </w:rPr>
-        <w:t>Зеркало в 2026 году работает как полноценный элемент композиции: задаёт ритм стене, добавляет света, визуально меняет пропорции комнаты и служит самостоятельным арт-объектом. Разобраться в новых формах и функциях бывает непросто, поэтому мы собрали практический гид по популярным моделям зеркал 2026 года. Он поможет выбрать модель осознанно: от геометрии и подсветки до оправы и сценария в конкретной комнате.</w:t>
+        <w:t>Зеркало в 2026 году работает наравне с мебелью и светом: задаёт ритм стене, добавляет комнате естественного света, меняет её пропорции и держит на себе роль самостоятельного арт-объекта. Новых форм и функций стало больше, и выбрать среди них бывает непросто. Мы собрали практический гид по популярным моделям зеркал 2026 года, чтобы решение получилось осознанным: от геометрии и подсветки до оправы и сценария в конкретной комнате.</w:t>
       </w:r>
     </w:p>
     <w:p>
@@ -37,7 +37,7 @@
         <w:rPr>
           <w:b w:val="0"/>
         </w:rPr>
-        <w:t>Хороший выбор начинается с четырёх вопросов к себе, ещё до открытия каталога:</w:t>
+        <w:t>Хороший выбор начинается с четырёх вопросов к себе, ещё до открытия каталога.</w:t>
       </w:r>
     </w:p>
     <w:p>
@@ -54,7 +54,7 @@
         <w:rPr>
           <w:b w:val="0"/>
         </w:rPr>
-        <w:t xml:space="preserve"> Зеркало для сборов в полный рост, акцент над консолью или функциональная модель в ванную.</w:t>
+        <w:t xml:space="preserve"> Зеркало для сборов в полный рост, акцент над консолью или рабочая модель в ванную.</w:t>
       </w:r>
     </w:p>
     <w:p>
@@ -71,7 +71,7 @@
         <w:rPr>
           <w:b w:val="0"/>
         </w:rPr>
-        <w:t xml:space="preserve"> Нужна ли подсветка для макияжа и бритья или достаточно декоративного свечения.</w:t>
+        <w:t xml:space="preserve"> Нужна подсветка для макияжа и бритья или достаточно декоративного свечения.</w:t>
       </w:r>
     </w:p>
     <w:p>
@@ -132,7 +132,7 @@
         <w:rPr>
           <w:b w:val="0"/>
         </w:rPr>
-        <w:t>Главный сдвиг сезона касается силуэта. На смену строгим прямоугольникам приходят мягкие и органические очертания, которые делают интерьер мягче и спокойнее.</w:t>
+        <w:t>Главный сдвиг сезона касается силуэта. Строгие прямоугольники уступают место мягким и органическим очертаниям, которые делают интерьер спокойнее.</w:t>
       </w:r>
     </w:p>
     <w:p>
@@ -189,7 +189,7 @@
         <w:rPr>
           <w:b w:val="0"/>
         </w:rPr>
-        <w:t>Самые выразительные формы сезона. Капля, лепесток, волна и мягкая асимметрия превращают зеркало в скульптуру. Одна такая модель на пустой стене заменяет декор и становится смысловым центром комнаты. Именно к этому направлению относится модель KAPSUS размером 200×80 см: вытянутый каплевидный силуэт держит внимание и работает как арт-объект.</w:t>
+        <w:t>Самые выразительные формы сезона. Капля, лепесток, волна и мягкая асимметрия превращают зеркало в скульптуру. Одна такая модель на пустой стене заменяет декор и становится смысловым центром комнаты. К этому направлению относится модель KAPSUS размером 200×80 см: вытянутый каплевидный силуэт держит внимание и работает как арт-объект.</w:t>
       </w:r>
     </w:p>
     <w:p>
@@ -208,7 +208,7 @@
         <w:rPr>
           <w:b w:val="0"/>
         </w:rPr>
-        <w:t>Классика остаётся востребованной и становится точнее по геометрии. Строгая геометрия уместна в минимализме и лофте, особенно в крупном формате. Модель KVADEN XL LED (200×100 см) показывает, как большой прямоугольник с подсветкой открывает пространство и добавляет ему графичности.</w:t>
+        <w:t>Классика остаётся востребованной и становится точнее по геометрии. Строгая форма уместна в минимализме и лофте, особенно в крупном формате. Модель KVADEN XL LED (200×100 см) показывает, как большой прямоугольник с подсветкой открывает пространство и добавляет ему графичности.</w:t>
       </w:r>
     </w:p>
     <w:p>
@@ -227,7 +227,7 @@
         <w:rPr>
           <w:b w:val="0"/>
         </w:rPr>
-        <w:t>LED-зеркало сегодня решает практическую задачу: даёт ровный свет для лица и одновременно работает как декор. Набор функций стоит подбирать под реальные привычки, а не по длине списка возможностей.</w:t>
+        <w:t>LED-зеркало сегодня решает практическую задачу: даёт ровный свет для лица и одновременно работает как декор. Набор функций стоит подбирать под реальные привычки. Длинный перечень опций сам по себе не делает пользование удобнее, поэтому смотрим на то, чем будете пользоваться каждый день.</w:t>
       </w:r>
     </w:p>
     <w:p>
@@ -329,7 +329,7 @@
         <w:rPr>
           <w:b w:val="0"/>
         </w:rPr>
-        <w:t xml:space="preserve"> Встроенные динамики для тех, кто любит музыку или подкасты во время сборов.</w:t>
+        <w:t xml:space="preserve"> Встроенные динамики для музыки или подкастов во время сборов.</w:t>
       </w:r>
     </w:p>
     <w:p>
@@ -337,7 +337,7 @@
         <w:rPr>
           <w:b w:val="0"/>
         </w:rPr>
-        <w:t>Модельный ряд GenGlass с индексом LED построен именно вокруг такой логики. SKYSIS NF LED (160×84 см) и SKYSO 2 NF LED (200×100 см) сочетают чистый силуэт с равномерной подсветкой, а FALENSO NF LED (200×80 см) показывает, как узкий вытянутый формат со светом работает в проёме между зонами.</w:t>
+        <w:t>Модельный ряд GenGlass с индексом LED построен вокруг такой логики. SKYSIS NF LED (160×84 см) и SKYSO 2 NF LED (200×100 см) сочетают чистый силуэт с равномерной подсветкой, а FALENSO NF LED (200×80 см) показывает, как узкий вытянутый формат со светом работает в проёме между зонами.</w:t>
       </w:r>
     </w:p>
     <w:p>
@@ -462,7 +462,7 @@
         <w:rPr>
           <w:b w:val="0"/>
         </w:rPr>
-        <w:t>Здесь зеркало встречает гостей и помогает собраться перед выходом. Подойдёт ростовая модель у стены или выразительная форма над консолью. Компактная KELUR (100×50 см) в золотой раме работает как аккуратный акцент, а полноразмерное зеркало решает задачу сборов в полный рост.</w:t>
+        <w:t>Здесь зеркало встречает гостей и помогает собраться перед выходом. Подойдёт ростовая модель у стены или выразительная форма над консолью. Компактная KELUR (100×50 см) в золотой раме работает как аккуратный акцент, а полноразмерное зеркало закрывает задачу сборов в полный рост.</w:t>
       </w:r>
     </w:p>
     <w:p>
@@ -481,7 +481,7 @@
         <w:rPr>
           <w:b w:val="0"/>
         </w:rPr>
-        <w:t>Приоритет у функций: подогрев против запотевания, ровный свет для лица, влагостойкость. LED-модели с сенсорным управлением и регулировкой температуры света закрывают все ежедневные задачи.</w:t>
+        <w:t>Приоритет у функций: подогрев против запотевания, ровный свет для лица, влагостойкость. LED-модели с сенсорным управлением и регулировкой температуры света закрывают ежедневные задачи. Оптимальная высота нижнего края зеркала над раковиной обычно составляет от 20 до 30 см, чтобы свет ложился на лицо без теней.</w:t>
       </w:r>
     </w:p>
     <w:p>
@@ -538,7 +538,7 @@
         <w:rPr>
           <w:b w:val="0"/>
         </w:rPr>
-        <w:t>Ростовое зеркало остаётся одним из самых практичных решений для интерьера. Оно нужно для сборов в полный рост и одновременно раздвигает границы комнаты: отражение добавляет глубины и света, а вертикальный формат приподнимает потолок визуально.</w:t>
+        <w:t>Ростовое зеркало остаётся одним из самых практичных решений для интерьера. Оно нужно для сборов в полный рост и одновременно раздвигает границы комнаты: отражение добавляет глубины и света, а вертикальный формат зрительно приподнимает потолок.</w:t>
       </w:r>
     </w:p>
     <w:p>
@@ -554,7 +554,7 @@
         <w:rPr>
           <w:b w:val="0"/>
         </w:rPr>
-        <w:t>Когда готовый размер не подходит под нишу, проём или конкретную стену, помогает изготовление на заказ. Индивидуальные габариты, форма, тип оправы и подсветки позволяют вписать зеркало в проект точно по месту. Это особенно ценно в нестандартных планировках и в дизайнерских интерьерах, где важна каждая деталь.</w:t>
+        <w:t>Когда готовый размер не подходит под нишу, проём или конкретную стену, выручает изготовление на заказ. Индивидуальные габариты, форма, тип оправы и подсветки позволяют вписать зеркало в проект точно по месту. Это особенно ценно в нестандартных планировках и дизайнерских интерьерах, где важна каждая деталь. GenGlass реализует интерьерные решения разной сложности, от отдельного зеркала до комплектации апартаментов, ресторанов и офисов.</w:t>
       </w:r>
     </w:p>
     <w:p>
@@ -573,7 +573,7 @@
         <w:rPr>
           <w:b w:val="0"/>
         </w:rPr>
-        <w:t>Даже удачная модель разочарует, если не учесть несколько нюансов:</w:t>
+        <w:t>Даже удачная модель разочарует, если упустить несколько нюансов.</w:t>
       </w:r>
     </w:p>
     <w:p>
@@ -607,7 +607,7 @@
         <w:rPr>
           <w:b w:val="0"/>
         </w:rPr>
-        <w:t xml:space="preserve"> Холодный яркий свет утомляет вечером, а тёплый мешает наносить макияж. Регулировка температуры снимает обе проблемы.</w:t>
+        <w:t xml:space="preserve"> Холодный яркий свет утомляет вечером, тёплый мешает наносить макияж. Регулировка температуры снимает обе проблемы.</w:t>
       </w:r>
     </w:p>
     <w:p>
@@ -658,7 +658,7 @@
         <w:rPr>
           <w:b w:val="0"/>
         </w:rPr>
-        <w:t xml:space="preserve"> Ниша или проём нередко требуют своих габаритов, и готовый размер здесь проигрывает изготовлению на заказ.</w:t>
+        <w:t xml:space="preserve"> Ниша или проём нередко требуют своих габаритов, и здесь выручает изготовление на заказ.</w:t>
       </w:r>
     </w:p>
     <w:p>
@@ -709,7 +709,7 @@
         <w:rPr>
           <w:b w:val="0"/>
         </w:rPr>
-        <w:t>LED-зеркало имеет встроенную светодиодную подсветку. Она даёт ровный свет для лица, создаёт декоративный эффект и часто дополняется сенсорным управлением, регулировкой яркости, подогревом против запотевания и аудиофункциями.</w:t>
+        <w:t>У LED-зеркала есть встроенная светодиодная подсветка. Она даёт ровный свет для лица, создаёт декоративный эффект и часто дополняется сенсорным управлением, регулировкой яркости, подогревом против запотевания и аудиофункциями.</w:t>
       </w:r>
     </w:p>
     <w:p>
@@ -793,9 +793,6 @@
         <w:jc w:val="center"/>
         <w:shd w:val="clear" w:color="auto" w:fill="1B6E4A"/>
       </w:pPr>
-      <w:r>
-        <w:t xml:space="preserve">  </w:t>
-      </w:r>
       <w:hyperlink r:id="rId9">
         <w:r>
           <w:rPr>

</xml_diff>